<commit_message>
Rename product to MediSafe; expand Section 4; remove word counts
Agent-Logs-Url: https://github.com/LU-Chuanyu/alan-lang1406/sessions/04218f9d-6d3c-43b9-affc-74f5471b7ce2

Co-authored-by: LU-Chuanyu <231466266+LU-Chuanyu@users.noreply.github.com>
</commit_message>
<xml_diff>
--- a/Business_Proposal_HO_Yin_Lun_21295050_T05_Professional.docx
+++ b/Business_Proposal_HO_Yin_Lun_21295050_T05_Professional.docx
@@ -13,9 +13,9 @@
         <w:rPr>
           <w:b/>
           <w:i w:val="0"/>
-          <w:sz w:val="52"/>
+          <w:sz w:val="64"/>
         </w:rPr>
-        <w:t>YOUR 24/7 HEALTHCARE CHATBOT</w:t>
+        <w:t>MEDISAFE</w:t>
       </w:r>
     </w:p>
     <w:p>
@@ -28,7 +28,7 @@
           <w:i/>
           <w:sz w:val="28"/>
         </w:rPr>
-        <w:t>A Voice-First Solution to Unlock HA Go for Hong Kong's Older Adults</w:t>
+        <w:t>A Voice-First, Cantonese-Native AI Assistant to Unlock HA Go for Hong Kong's Older Adults</w:t>
       </w:r>
     </w:p>
     <w:p/>
@@ -125,7 +125,7 @@
           <w:b w:val="0"/>
           <w:i w:val="0"/>
         </w:rPr>
-        <w:t>Hong Kong is undergoing a simultaneous demographic and digital transformation. By 2030, more than one in four residents will be aged 65 or above (Lau &amp; Fong, 2021), yet HA Go - the Hospital Authority's primary digital service platform - presents substantial usability barriers for this cohort, including small touch targets, densely nested menus, occasional English-only prompts, and unreliable biometric authentication (Hospital Authority, 2025; Luo, Mo, &amp; Li, 2023; Society for Community Organization [SoCO], 2023). This proposal introduces "Your 24/7 Healthcare Chatbot," a Cantonese-native, voice-first artificial-intelligence assistant embedded within HA Go that enables older adults to access appointments, medication reminders, and health information through natural spoken interaction rather than complex on-screen navigation. The solution is grounded in the Technology Readiness and Acceptance Model (Davis, 1989; Parasuraman &amp; Colby, 2015) and is fully aligned with the Primary Healthcare Blueprint (Health Bureau, 2022) and the World Health Organization's Global Strategy on Digital Health (WHO, 2021). A budget of HK$2,000,000 is requested for an 18-month pilot-to-rollout programme, projected to reduce missed specialist appointments by 30%, serve 40,000 senior users by Month 18, and deliver a unit cost of HK$50 per senior - generating an estimated annual saving of more than HK$13 million to the Hospital Authority and a return on investment exceeding six times the requested funding within the first year of citywide operation.</w:t>
+        <w:t>Hong Kong is undergoing a simultaneous demographic and digital transformation. By 2030, more than one in four residents will be aged 65 or above (Lau &amp; Fong, 2021), yet HA Go - the Hospital Authority's primary digital service platform - presents substantial usability barriers for this cohort, including small touch targets, densely nested menus, occasional English-only prompts, and unreliable biometric authentication (Hospital Authority, 2025; Luo, Mo, &amp; Li, 2023; Society for Community Organization [SoCO], 2023). This proposal introduces MediSafe, a Cantonese-native, voice-first artificial-intelligence assistant embedded within HA Go that enables older adults to access appointments, medication reminders, and health information through natural spoken interaction rather than complex on-screen navigation. MediSafe is grounded in the Technology Readiness and Acceptance Model (Davis, 1989; Parasuraman &amp; Colby, 2015) and is fully aligned with the Primary Healthcare Blueprint (Health Bureau, 2022) and the World Health Organization's Global Strategy on Digital Health (WHO, 2021). A budget of HK$2,000,000 is requested for an 18-month pilot-to-rollout programme, projected to reduce missed specialist appointments by 30%, serve 40,000 senior users by Month 18, and deliver a unit cost of HK$50 per senior - generating an estimated annual saving of more than HK$13 million to the Hospital Authority and a return on investment exceeding six times the requested funding within the first year of citywide operation.</w:t>
       </w:r>
     </w:p>
     <w:p>
@@ -154,7 +154,7 @@
           <w:b w:val="0"/>
           <w:i w:val="0"/>
         </w:rPr>
-        <w:t>This proposal applies the Technology Readiness and Acceptance Model (Davis, 1989; Parasuraman &amp; Colby, 2015) to diagnose three principal barriers - perceived complexity, low self-efficacy, and user discomfort - and offers a single integrated response: "Your 24/7 Healthcare Chatbot." The document first evaluates the market gap, then details the proposed solution, the implementation plan, and the financial plan, before concluding with a formal call to action.</w:t>
+        <w:t>This proposal applies the Technology Readiness and Acceptance Model (Davis, 1989; Parasuraman &amp; Colby, 2015) to diagnose three principal barriers - perceived complexity, low self-efficacy, and user discomfort - and offers a single integrated response: MediSafe. The document first evaluates the market gap, then details the proposed solution, the implementation plan, and the financial plan, before concluding with a formal call to action.</w:t>
       </w:r>
     </w:p>
     <w:p>
@@ -333,16 +333,6 @@
       </w:r>
     </w:p>
     <w:p>
-      <w:r>
-        <w:rPr>
-          <w:b w:val="0"/>
-          <w:i/>
-          <w:sz w:val="18"/>
-        </w:rPr>
-        <w:t>(Section 3 word count: approximately 310 words.)</w:t>
-      </w:r>
-    </w:p>
-    <w:p>
       <w:pPr>
         <w:pStyle w:val="Heading1"/>
       </w:pPr>
@@ -361,7 +351,7 @@
         <w:rPr>
           <w:color w:val="1F4E79"/>
         </w:rPr>
-        <w:t>4.1 "Your 24/7 Healthcare Chatbot": A Voice-First Companion</w:t>
+        <w:t>4.1 MediSafe: Product Overview</w:t>
       </w:r>
     </w:p>
     <w:p>
@@ -370,7 +360,7 @@
           <w:b w:val="0"/>
           <w:i w:val="0"/>
         </w:rPr>
-        <w:t>The proposed solution is a Cantonese-native, voice-first artificial-intelligence assistant embedded directly within HA Go, requiring neither a separate download nor a new user account. The user activates a single, prominently sized microphone button and issues a spoken request - for example, requesting tomorrow's appointment schedule. The assistant responds in clear, natural Cantonese synthesised through the ElevenLabs Multilingual v2 voice model (ElevenLabs, 2024) at telephone-call volume, while simultaneously displaying an equivalent on-screen response in 22-point text to accommodate users with hearing impairment.</w:t>
+        <w:t>MediSafe is a Cantonese-native, voice-first artificial-intelligence assistant embedded directly within the existing HA Go application. It does not require a separate download, registration, or change of credentials; users access MediSafe through a single, prominently sized microphone button placed at the centre of the HA Go home screen. A spoken request is automatically transcribed by an on-device Cantonese speech-recognition module, interpreted through a closed retrieval-augmented generation pipeline restricted to Hospital Authority-approved content, and answered in clear, natural Cantonese synthesised through the ElevenLabs Multilingual v2 voice model (ElevenLabs, 2024). Every spoken response is mirrored on-screen in 22-point text to support users with hearing impairment, and a persistent "please repeat" control allows any answer to be replayed at slower speed.</w:t>
       </w:r>
     </w:p>
     <w:p>
@@ -381,7 +371,7 @@
         <w:rPr>
           <w:color w:val="1F4E79"/>
         </w:rPr>
-        <w:t>4.2 Dismantling Each Barrier of the Technology Readiness and Acceptance Model</w:t>
+        <w:t>4.2 Core Functional Modules</w:t>
       </w:r>
     </w:p>
     <w:p>
@@ -389,7 +379,13 @@
         <w:pStyle w:val="ListBullet"/>
       </w:pPr>
       <w:r>
-        <w:t>Perceived ease of use: Voice interaction eliminates approximately 90% of touch interactions. A single spoken sentence replaces an average of seven HA Go screens (Hospital Authority, 2025).</w:t>
+        <w:rPr>
+          <w:b/>
+        </w:rPr>
+        <w:t>Conversational service access:</w:t>
+      </w:r>
+      <w:r>
+        <w:t xml:space="preserve"> Routine appointment and medication management - the user can request an appointment summary, reschedule a slot, refill a prescription, or request a medication reminder entirely through speech, with all confirmations relayed back in Cantonese and on-screen text.</w:t>
       </w:r>
     </w:p>
     <w:p>
@@ -397,7 +393,13 @@
         <w:pStyle w:val="ListBullet"/>
       </w:pPr>
       <w:r>
-        <w:t>Perceived usefulness: A unified interface manages appointments, medication reminders, and plain-language explanations of medical terminology, directly supporting the World Health Organization's mandate for people-centred digital health (WHO, 2021).</w:t>
+        <w:rPr>
+          <w:b/>
+        </w:rPr>
+        <w:t>Plain-language medical interpretation:</w:t>
+      </w:r>
+      <w:r>
+        <w:t xml:space="preserve"> MediSafe parses laboratory results and discharge instructions and translates specialist terminology into plain Cantonese, reducing reliance on family members for routine interpretation (Bickmore et al., 2018).</w:t>
       </w:r>
     </w:p>
     <w:p>
@@ -405,7 +407,55 @@
         <w:pStyle w:val="ListBullet"/>
       </w:pPr>
       <w:r>
-        <w:t>Discomfort and insecurity: Cantonese speech, large-format text, and a forgiving "please repeat" recovery loop reduce the fear of operational error that Czaja et al. (2019) and Vaportzis et al. (2017) identify as the dominant emotional barrier to technology adoption among older adults.</w:t>
+        <w:rPr>
+          <w:b/>
+        </w:rPr>
+        <w:t>Proactive medication and follow-up reminders:</w:t>
+      </w:r>
+      <w:r>
+        <w:t xml:space="preserve"> Adherence reminders are issued at the user's preferred time and tone, with automatic escalation to a designated caregiver via SMS if a critical dose is not acknowledged within a configurable window.</w:t>
+      </w:r>
+    </w:p>
+    <w:p>
+      <w:pPr>
+        <w:pStyle w:val="ListBullet"/>
+      </w:pPr>
+      <w:r>
+        <w:rPr>
+          <w:b/>
+        </w:rPr>
+        <w:t>Voice-passphrase authentication:</w:t>
+      </w:r>
+      <w:r>
+        <w:t xml:space="preserve"> Persistent fingerprint-login failure (Luo et al., 2023) is bypassed through an opt-in voice-passphrase authentication path, validated against a one-time registration recording held under HA-grade encryption; no raw audio is retained beyond the verification window.</w:t>
+      </w:r>
+    </w:p>
+    <w:p>
+      <w:pPr>
+        <w:pStyle w:val="ListBullet"/>
+      </w:pPr>
+      <w:r>
+        <w:rPr>
+          <w:b/>
+        </w:rPr>
+        <w:t>Triage and clinical hand-off:</w:t>
+      </w:r>
+      <w:r>
+        <w:t xml:space="preserve"> Any symptom-related enquiry that exceeds MediSafe's approved scope is automatically refused and routed to the Hospital Authority's registered nurse hotline, with the conversation context forwarded to the human operator to avoid the user repeating themselves.</w:t>
+      </w:r>
+    </w:p>
+    <w:p>
+      <w:pPr>
+        <w:pStyle w:val="ListBullet"/>
+      </w:pPr>
+      <w:r>
+        <w:rPr>
+          <w:b/>
+        </w:rPr>
+        <w:t>Caregiver portal:</w:t>
+      </w:r>
+      <w:r>
+        <w:t xml:space="preserve"> A consenting family member or community-centre worker may receive a daily summary of appointments and medication adherence, enabling distributed support without compromising the senior's privacy controls.</w:t>
       </w:r>
     </w:p>
     <w:p>
@@ -416,7 +466,7 @@
         <w:rPr>
           <w:color w:val="1F4E79"/>
         </w:rPr>
-        <w:t>4.3 Addressing the Opposing View</w:t>
+        <w:t>4.3 How MediSafe Dismantles Each TRAM Barrier</w:t>
       </w:r>
     </w:p>
     <w:p>
@@ -425,7 +475,49 @@
           <w:b w:val="0"/>
           <w:i w:val="0"/>
         </w:rPr>
-        <w:t>A substantive counter-argument warrants direct engagement. Bender, Gebru, McMillan-Major, and Shmitchell (2021) demonstrate that large language models can hallucinate, encode bias, and mislead users - risks that are unacceptable in a clinical setting. The proposed design responds to each risk through specific architectural controls: the chatbot operates on a closed retrieval-augmented generation framework restricted to Hospital Authority-approved content; out-of-scope clinical questions are explicitly refused; any symptom-related enquiry is routed to a registered nurse hotline; and all model responses are logged and reviewed monthly by Hospital Authority clinicians. These controls translate the warning of Bender et al. (2021) into an operational design constraint that the system already satisfies.</w:t>
+        <w:t>MediSafe is engineered to address each of the three Technology Readiness and Acceptance Model inhibitors directly and measurably.</w:t>
+      </w:r>
+    </w:p>
+    <w:p>
+      <w:pPr>
+        <w:pStyle w:val="ListBullet"/>
+      </w:pPr>
+      <w:r>
+        <w:rPr>
+          <w:b/>
+        </w:rPr>
+        <w:t xml:space="preserve">Perceived ease of use - </w:t>
+      </w:r>
+      <w:r>
+        <w:t xml:space="preserve"> Voice interaction eliminates approximately 90% of touch interactions. A single spoken sentence replaces an average of seven HA Go screens (Hospital Authority, 2025); the voice-passphrase path additionally removes the fingerprint-failure loop documented by Luo et al. (2023). The user no longer needs to memorise menu locations, distinguish among small icons, or perform precise pinch-zoom gestures.</w:t>
+      </w:r>
+    </w:p>
+    <w:p>
+      <w:pPr>
+        <w:pStyle w:val="ListBullet"/>
+      </w:pPr>
+      <w:r>
+        <w:rPr>
+          <w:b/>
+        </w:rPr>
+        <w:t xml:space="preserve">Perceived usefulness - </w:t>
+      </w:r>
+      <w:r>
+        <w:t xml:space="preserve"> A unified conversational interface manages appointments, medication reminders, and plain-language explanations of medical terminology, directly supporting the World Health Organization's mandate for people-centred digital health (WHO, 2021). Because MediSafe operates 24 hours a day, users can obtain reliable health information outside clinic hours without depending on a family member's availability.</w:t>
+      </w:r>
+    </w:p>
+    <w:p>
+      <w:pPr>
+        <w:pStyle w:val="ListBullet"/>
+      </w:pPr>
+      <w:r>
+        <w:rPr>
+          <w:b/>
+        </w:rPr>
+        <w:t xml:space="preserve">Discomfort and insecurity - </w:t>
+      </w:r>
+      <w:r>
+        <w:t xml:space="preserve"> Cantonese speech, large-format text, a forgiving "please repeat" recovery loop, and a non-judgemental warm voice persona reduce the fear of operational error that Czaja et al. (2019) and Vaportzis et al. (2017) identify as the dominant emotional barrier to technology adoption among older adults.</w:t>
       </w:r>
     </w:p>
     <w:p>
@@ -436,7 +528,7 @@
         <w:rPr>
           <w:color w:val="1F4E79"/>
         </w:rPr>
-        <w:t>4.4 Strategic Alignment and Competitive Position</w:t>
+        <w:t>4.4 Community-Wide Benefits</w:t>
       </w:r>
     </w:p>
     <w:p>
@@ -445,17 +537,117 @@
           <w:b w:val="0"/>
           <w:i w:val="0"/>
         </w:rPr>
-        <w:t>The solution simultaneously advances three institutional priorities: the Primary Healthcare Blueprint's transition toward preventive, community-based care (Health Bureau, 2022); the digital-inclusion mandate of the Smart City Blueprint 2.0 (Office of the Government Chief Information Officer, 2023); and the Hospital Authority's service-quality key performance indicators (Hospital Authority, 2025). The proposed system would constitute the first Cantonese-first, senior-first, Hospital Authority-integrated voice agent in Hong Kong, establishing a defensible first-mover position in a strategically significant market segment.</w:t>
+        <w:t>Although MediSafe is delivered through an individual user interface, its benefits accrue across multiple stakeholder groups in the public-health ecosystem.</w:t>
+      </w:r>
+    </w:p>
+    <w:p>
+      <w:pPr>
+        <w:pStyle w:val="ListBullet"/>
+      </w:pPr>
+      <w:r>
+        <w:rPr>
+          <w:b/>
+        </w:rPr>
+        <w:t xml:space="preserve">Older adults: </w:t>
+      </w:r>
+      <w:r>
+        <w:t xml:space="preserve"> Independence in managing appointments and medication is restored, self-reported confidence is expected to rise, and avoidable emergency department visits arising from missed medication or follow-ups are reduced (Wildenbos et al., 2018).</w:t>
+      </w:r>
+    </w:p>
+    <w:p>
+      <w:pPr>
+        <w:pStyle w:val="ListBullet"/>
+      </w:pPr>
+      <w:r>
+        <w:rPr>
+          <w:b/>
+        </w:rPr>
+        <w:t xml:space="preserve">Family caregivers: </w:t>
+      </w:r>
+      <w:r>
+        <w:t xml:space="preserve"> Routine interpretation of medical jargon, calendar coordination, and login troubleshooting - tasks currently absorbed by family members - are handled by MediSafe. The Census and Statistics Department (2023) data on solo-living and spouse-only senior households indicate that this caregiver relief is most valuable precisely where informal support is scarcest.</w:t>
+      </w:r>
+    </w:p>
+    <w:p>
+      <w:pPr>
+        <w:pStyle w:val="ListBullet"/>
+      </w:pPr>
+      <w:r>
+        <w:rPr>
+          <w:b/>
+        </w:rPr>
+        <w:t xml:space="preserve">Frontline clinicians and Hospital Authority staff: </w:t>
+      </w:r>
+      <w:r>
+        <w:t xml:space="preserve"> Telephone enquiry volumes regarding routine matters - appointment timings, medication instructions, and result interpretation - are diverted from frontline clerical and nursing staff to an always-available, audited automated channel, freeing clinical capacity for higher-acuity work.</w:t>
+      </w:r>
+    </w:p>
+    <w:p>
+      <w:pPr>
+        <w:pStyle w:val="ListBullet"/>
+      </w:pPr>
+      <w:r>
+        <w:rPr>
+          <w:b/>
+        </w:rPr>
+        <w:t xml:space="preserve">The Hospital Authority and the public health system: </w:t>
+      </w:r>
+      <w:r>
+        <w:t xml:space="preserve"> A conservative 30% reduction in missed specialist appointments among MediSafe users is projected to save the Hospital Authority more than HK$13 million annually (Health Bureau, 2022), reduce clinic congestion, and improve scheduling predictability across the public hospital network.</w:t>
+      </w:r>
+    </w:p>
+    <w:p>
+      <w:pPr>
+        <w:pStyle w:val="ListBullet"/>
+      </w:pPr>
+      <w:r>
+        <w:rPr>
+          <w:b/>
+        </w:rPr>
+        <w:t xml:space="preserve">The wider community and government: </w:t>
+      </w:r>
+      <w:r>
+        <w:t xml:space="preserve"> By extending equitable digital access to a population otherwise excluded from the e-health ecosystem, MediSafe advances the digital-inclusion mandate of the Smart City Blueprint 2.0 (Office of the Government Chief Information Officer, 2023) and operationalises the Primary Healthcare Blueprint's commitment to community-based, preventive care (Health Bureau, 2022).</w:t>
+      </w:r>
+    </w:p>
+    <w:p>
+      <w:pPr>
+        <w:pStyle w:val="Heading2"/>
+      </w:pPr>
+      <w:r>
+        <w:rPr>
+          <w:color w:val="1F4E79"/>
+        </w:rPr>
+        <w:t>4.5 Addressing the Opposing View</w:t>
       </w:r>
     </w:p>
     <w:p>
       <w:r>
         <w:rPr>
           <w:b w:val="0"/>
-          <w:i/>
-          <w:sz w:val="18"/>
+          <w:i w:val="0"/>
         </w:rPr>
-        <w:t>(Section 4 word count: approximately 290 words.)</w:t>
+        <w:t>A substantive counter-argument warrants direct engagement. Bender, Gebru, McMillan-Major, and Shmitchell (2021) demonstrate that large language models can hallucinate, encode bias, and mislead users - risks that are unacceptable in a clinical setting. MediSafe responds to each risk through specific architectural controls: the system operates on a closed retrieval-augmented generation framework restricted to Hospital Authority-approved content; out-of-scope clinical questions are explicitly refused; any symptom-related enquiry is routed to a registered nurse hotline; and all model responses are logged and reviewed monthly by Hospital Authority clinicians. These controls translate the warning of Bender et al. (2021) into an operational design constraint that the system already satisfies.</w:t>
+      </w:r>
+    </w:p>
+    <w:p>
+      <w:pPr>
+        <w:pStyle w:val="Heading2"/>
+      </w:pPr>
+      <w:r>
+        <w:rPr>
+          <w:color w:val="1F4E79"/>
+        </w:rPr>
+        <w:t>4.6 Strategic Alignment and Competitive Position</w:t>
+      </w:r>
+    </w:p>
+    <w:p>
+      <w:r>
+        <w:rPr>
+          <w:b w:val="0"/>
+          <w:i w:val="0"/>
+        </w:rPr>
+        <w:t>MediSafe simultaneously advances three institutional priorities: the Primary Healthcare Blueprint's transition toward preventive, community-based care (Health Bureau, 2022); the digital-inclusion mandate of the Smart City Blueprint 2.0 (Office of the Government Chief Information Officer, 2023); and the Hospital Authority's service-quality key performance indicators (Hospital Authority, 2025). MediSafe would constitute the first Cantonese-first, senior-first, Hospital Authority-integrated voice agent in Hong Kong, establishing a defensible first-mover position in a strategically significant market segment.</w:t>
       </w:r>
     </w:p>
     <w:p>
@@ -486,7 +678,7 @@
           <w:b w:val="0"/>
           <w:i w:val="0"/>
         </w:rPr>
-        <w:t>To deploy a Cantonese voice-first chatbot embedded within HA Go and to onboard 40,000 senior users by Month 18.</w:t>
+        <w:t>To deploy MediSafe as a Cantonese voice-first module embedded within HA Go and to onboard 40,000 senior users by Month 18.</w:t>
       </w:r>
     </w:p>
     <w:p>
@@ -564,7 +756,7 @@
         <w:pStyle w:val="ListBullet"/>
       </w:pPr>
       <w:r>
-        <w:t>Conduct a controlled pilot with 2,000 older adults across Sham Shui Po, Kwun Tong, and Wong Tai Sin - the three districts with the highest density of seniors living alone (Census and Statistics Department, 2023).</w:t>
+        <w:t>Conduct a controlled MediSafe pilot with 2,000 older adults across Sham Shui Po, Kwun Tong, and Wong Tai Sin - the three districts with the highest density of seniors living alone (Census and Statistics Department, 2023).</w:t>
       </w:r>
     </w:p>
     <w:p>
@@ -589,7 +781,7 @@
         <w:pStyle w:val="ListBullet"/>
       </w:pPr>
       <w:r>
-        <w:t>Scale deployment across all 18 districts, in partnership with the Society for Community Organization (SoCO, 2023) and district elderly community centres for in-person onboarding support.</w:t>
+        <w:t>Scale MediSafe across all 18 districts, in partnership with the Society for Community Organization (SoCO, 2023) and district elderly community centres for in-person onboarding support.</w:t>
       </w:r>
     </w:p>
     <w:p>
@@ -608,7 +800,7 @@
         <w:pStyle w:val="ListBullet"/>
       </w:pPr>
       <w:r>
-        <w:t>Month 7: Beta release passes Hospital Authority clinical-safety review.</w:t>
+        <w:t>Month 7: MediSafe beta release passes Hospital Authority clinical-safety review.</w:t>
       </w:r>
     </w:p>
     <w:p>
@@ -628,16 +820,6 @@
       </w:r>
     </w:p>
     <w:p>
-      <w:r>
-        <w:rPr>
-          <w:b w:val="0"/>
-          <w:i/>
-          <w:sz w:val="18"/>
-        </w:rPr>
-        <w:t>(Section 5 word count: approximately 200 words.)</w:t>
-      </w:r>
-    </w:p>
-    <w:p>
       <w:pPr>
         <w:pStyle w:val="Heading1"/>
       </w:pPr>
@@ -654,7 +836,7 @@
           <w:b w:val="0"/>
           <w:i w:val="0"/>
         </w:rPr>
-        <w:t>A total budget of HK$2,000,000 is requested, allocated for measurable and scalable impact within the 18-month implementation horizon, as follows:</w:t>
+        <w:t>A total budget of HK$2,000,000 is requested for MediSafe, allocated for measurable and scalable impact within the 18-month implementation horizon, as follows:</w:t>
       </w:r>
     </w:p>
     <w:p>
@@ -759,16 +941,6 @@
       </w:r>
     </w:p>
     <w:p>
-      <w:r>
-        <w:rPr>
-          <w:b w:val="0"/>
-          <w:i/>
-          <w:sz w:val="18"/>
-        </w:rPr>
-        <w:t>(Section 6 word count: approximately 170 words.)</w:t>
-      </w:r>
-    </w:p>
-    <w:p>
       <w:pPr>
         <w:pStyle w:val="Heading1"/>
       </w:pPr>
@@ -785,7 +957,7 @@
           <w:b w:val="0"/>
           <w:i w:val="0"/>
         </w:rPr>
-        <w:t>Hong Kong's population is ageing rapidly, its public services are digitising still more rapidly, and the gap between the two is widening. "Your 24/7 Healthcare Chatbot" closes that gap with a single, defensible proposition: any user able to speak should be able to use HA Go. By substituting Cantonese conversation for touch interaction, intent recognition for iconographic navigation, and inclusive design for inadvertent exclusion, the proposed solution restores service access to tens of thousands of older adults while delivering substantial recurrent savings to the Hospital Authority.</w:t>
+        <w:t>Hong Kong's population is ageing rapidly, its public services are digitising still more rapidly, and the gap between the two is widening. MediSafe closes that gap with a single, defensible proposition: any user able to speak should be able to use HA Go. By substituting Cantonese conversation for touch interaction, intent recognition for iconographic navigation, and inclusive design for inadvertent exclusion, MediSafe restores service access to tens of thousands of older adults while delivering substantial recurrent savings to the Hospital Authority.</w:t>
       </w:r>
     </w:p>
     <w:p>
@@ -794,7 +966,7 @@
           <w:b w:val="0"/>
           <w:i w:val="0"/>
         </w:rPr>
-        <w:t>The Hospital Authority is invited to partner on this initiative in order to:</w:t>
+        <w:t>The Hospital Authority is invited to partner on MediSafe in order to:</w:t>
       </w:r>
     </w:p>
     <w:p>
@@ -827,17 +999,7 @@
           <w:b w:val="0"/>
           <w:i w:val="0"/>
         </w:rPr>
-        <w:t>Approval of the requested HK$2,000,000 will enable the deployment, within 18 months, of a Cantonese voice-first interface serving 40,000 older adults - converting a long-standing accessibility barrier into a measurable demonstration of inclusive digital governance.</w:t>
-      </w:r>
-    </w:p>
-    <w:p>
-      <w:r>
-        <w:rPr>
-          <w:b w:val="0"/>
-          <w:i/>
-          <w:sz w:val="18"/>
-        </w:rPr>
-        <w:t>(Section 7 word count: approximately 105 words.)</w:t>
+        <w:t>Approval of the requested HK$2,000,000 will enable the deployment of MediSafe, within 18 months, to 40,000 older adults - converting a long-standing accessibility barrier into a measurable demonstration of inclusive digital governance.</w:t>
       </w:r>
     </w:p>
     <w:p>

</xml_diff>